<commit_message>
N244 cover letter v0.2: Andrejus signs, call-back to his mobile
Co-Authored-By: Claude Sonnet 5.5 <noreply@anthropic.com>
Claude-Session: https://claude.ai/code/session_01GKtZPsRP1QiHjpno9d5HfH
</commit_message>
<xml_diff>
--- a/Outputs/2026-10-22_Legal_MSEM-019JE538_N244-Cover-Letter-Payment-Callback_DRAFT_v0.2.docx
+++ b/Outputs/2026-10-22_Legal_MSEM-019JE538_N244-Cover-Letter-Payment-Callback_DRAFT_v0.2.docx
@@ -27,13 +27,13 @@
           <w:b/>
           <w:bCs/>
         </w:rPr>
-        <w:t xml:space="preserve">Before sending, fill the three [brackets]</w:t>
+        <w:t xml:space="preserve">Before sending, fill the [brackets]</w:t>
       </w:r>
       <w:r>
         <w:t xml:space="preserve"> </w:t>
       </w:r>
       <w:r>
-        <w:t xml:space="preserve">(fee, call-back number, signer)</w:t>
+        <w:t xml:space="preserve">(fee, Andrejus’s mobile number, the hours he is free)</w:t>
       </w:r>
       <w:r>
         <w:t xml:space="preserve"> </w:t>
@@ -204,7 +204,7 @@
           <w:b/>
           <w:bCs/>
         </w:rPr>
-        <w:t xml:space="preserve">Please telephone me on [CALL-BACK NUMBER – Minda 07855 463292 or Andrejus’s number] so that I can pay the fee by card.</w:t>
+        <w:t xml:space="preserve">Please telephone me on [ANDREJUS’S MOBILE NUMBER] so that I can pay the fee by card.</w:t>
       </w:r>
       <w:r>
         <w:t xml:space="preserve"> </w:t>
@@ -245,7 +245,7 @@
         <w:br/>
       </w:r>
       <w:r>
-        <w:t xml:space="preserve">[Minda Gaudiesius / Andrejus Prutkovas]</w:t>
+        <w:t xml:space="preserve">Andrejus Prutkovas</w:t>
       </w:r>
       <w:r>
         <w:br/>

</xml_diff>

<commit_message>
N244 cover letter v0.2: add Andrejus mobile for payment call-back
Co-Authored-By: Claude Sonnet 5.5 <noreply@anthropic.com>
Claude-Session: https://claude.ai/code/session_01GKtZPsRP1QiHjpno9d5HfH
</commit_message>
<xml_diff>
--- a/Outputs/2026-10-22_Legal_MSEM-019JE538_N244-Cover-Letter-Payment-Callback_DRAFT_v0.2.docx
+++ b/Outputs/2026-10-22_Legal_MSEM-019JE538_N244-Cover-Letter-Payment-Callback_DRAFT_v0.2.docx
@@ -33,7 +33,7 @@
         <w:t xml:space="preserve"> </w:t>
       </w:r>
       <w:r>
-        <w:t xml:space="preserve">(fee, Andrejus’s mobile number, the hours he is free)</w:t>
+        <w:t xml:space="preserve">(fee, the hours he is free)</w:t>
       </w:r>
       <w:r>
         <w:t xml:space="preserve"> </w:t>
@@ -204,7 +204,7 @@
           <w:b/>
           <w:bCs/>
         </w:rPr>
-        <w:t xml:space="preserve">Please telephone me on [ANDREJUS’S MOBILE NUMBER] so that I can pay the fee by card.</w:t>
+        <w:t xml:space="preserve">Please telephone me on 07966 347462 so that I can pay the fee by card.</w:t>
       </w:r>
       <w:r>
         <w:t xml:space="preserve"> </w:t>

</xml_diff>